<commit_message>
GRC course v4: foundational topics, quizzes and final assessment
- New unit 02: technical foundations (identities, directory, networks,
  cloud shared responsibility, protection, applications), each concept
  through what it is, the risk, the control and the evidence
- Business linkage worked example, control design/implementation/operating
  gaps, indicators (KGI/KPI/KRI/KCI) and a one-page management report
- Frameworks in three depth tiers, CSF vs RMF, gap vs maturity, and a
  partial-coverage mapping exercise
- Developed policy anatomy, personnel security, TPRM lifecycle and
  BIA/BCP/DRP/IR without duplicating existing slides
- Nine unit quizzes and a practical final assessment in the workbook,
  with explained answers, distractor reasons and a rubric
- Deck now 231 slides; control numbers no longer break across lines

Co-Authored-By: Claude Opus 5.5 <noreply@anthropic.com>
Claude-Session: https://claude.ai/code/session_017KDotA7czqmM3dopZEyKjC
</commit_message>
<xml_diff>
--- a/GRC_Beginner_Course/ملخص_التغييرات_والتحديث_الدوري.docx
+++ b/GRC_Beginner_Course/ملخص_التغييرات_والتحديث_الدوري.docx
@@ -53,7 +53,7 @@
           <w:sz w:val="24"/>
           <w:szCs w:val="24"/>
         </w:rPr>
-        <w:t>كيف تبدأ في GRC · النسخة 3: التصميم البصري · 27 أكتوبر 2026</w:t>
+        <w:t>كيف تبدأ في GRC · النسخة 4: الموضوعات التأسيسية · 27 أكتوبر 2026</w:t>
       </w:r>
     </w:p>
     <w:p>
@@ -85,7 +85,7 @@
           <w:b w:val="0"/>
           <w:bCs w:val="0"/>
         </w:rPr>
-        <w:t>أهم التغييرات في هذه النسخة</w:t>
+        <w:t>ما طُوِّر وما أُضيف في هذه النسخة</w:t>
       </w:r>
     </w:p>
     <w:p>
@@ -99,7 +99,7 @@
           <w:b w:val="0"/>
           <w:bCs w:val="0"/>
         </w:rPr>
-        <w:t>توازن الخط</w:t>
+        <w:t>ما أُضيف</w:t>
       </w:r>
     </w:p>
     <w:p>
@@ -116,7 +116,7 @@
           <w:sz w:val="21"/>
           <w:szCs w:val="21"/>
         </w:rPr>
-        <w:t>• مقياس خط واحد للعرض كله: العناوين 30 نقطة، والنص الأساسي 18 إلى 20 نقطة، والجداول والنماذج 16 نقطة فأكثر، والمصادر والتذييلات وتسميات النماذج 12 نقطة. والعبارة المفتاحية القصيرة وحدها قد تكبر.</w:t>
+        <w:t>• وحدة جديدة: الأساس التقني لمختص GRC (الشرائح 18 إلى 31). الهويات والصلاحيات (حساب عادي وإداري، المصادقة والتفويض، MFA وRBAC والحد الأدنى من الصلاحيات وفصل المهام)، والدليل المركزي بفكرته العامة، والشبكات والسجلات، والسحابة والمسؤولية المشتركة بأمثلة رُفاد، والحماية (الثغرات والتحديثات والتشفير والنسخ وDLP)، والتطبيقات والتغيير. كل مفهوم بأربعة أسئلة: ما هو؟ ما الخطر؟ ما الضابط؟ ما الدليل؟ بلا OSI ولا بروتوكولات ولا أوامر ولا إعداد منتجات. وتأتي بعد التعريف بالمجال وقبل المفاهيم والتطبيقات، فصارت الوحدات تسعاً.</w:t>
       </w:r>
     </w:p>
     <w:p>
@@ -133,7 +133,7 @@
           <w:sz w:val="21"/>
           <w:szCs w:val="21"/>
         </w:rPr>
-        <w:t>• نص القراءة (المتن والجداول والنماذج) بوسيط 18 نقطة في PowerPoint:‏ 66% منه 18 نقطة فأكثر، و96% منه 16 نقطة فأكثر، و4% أصغر من 16 نقطة. والمصادر والتذييلات وتسميات النماذج 12 إلى 13 نقطة، والعناوين 30 نقطة.</w:t>
+        <w:t>• GRC وأهداف العمل: أهداف رُفاد الأربعة، ومثال محلول من الهدف إلى الأصل والخطر والضابط والمالك والمؤشر وقرار الإدارة، وصياغة الأثر بلغة الأعمال، ثم تمرين وإجابة (الشرائح 70 إلى 73).</w:t>
       </w:r>
     </w:p>
     <w:p>
@@ -150,7 +150,7 @@
           <w:sz w:val="21"/>
           <w:szCs w:val="21"/>
         </w:rPr>
-        <w:t>• لم يُصغَّر نص لحشر محتوى. ما طال قُسّم أو نُقلت تفاصيله إلى ملاحظات المتحدث: الملاحظة في التطبيق 4 صارت شريحتين في المثال وفي الإجابة، وإجابات الأسئلة الأربعة على الأدلة اختُصرت على الشريحة وبقيت كاملة في الملاحظات والكراسة.</w:t>
+        <w:t>• التصميم والتنفيذ والتشغيل: ثلاث فجوات في مراجعة الصلاحيات، لكل منها حالة ودليل (المسؤولون مستثنون من المراجعة، ومعيار لم يبدأ تطبيقه، وربع سنة فائت)، ثم تمرين وإجابة (الشرائح 115 إلى 119).</w:t>
       </w:r>
     </w:p>
     <w:p>
@@ -167,7 +167,7 @@
           <w:sz w:val="21"/>
           <w:szCs w:val="21"/>
         </w:rPr>
-        <w:t>• ما بقي أصغر من 16 نقطة: تسميات المخططات (خلايا المصفوفة، وأوصاف المخطط التنظيمي، وأنظمة الحالة)، ونماذج السيرة ولينكدإن التي تحاكي حجم النص الحقيقي، والنظرة العامة على سجل المخاطر بأعمدته الثلاثة عشر (الشريحة 53)، وتليها ثلاث شرائح تكبّر أعمدته (الشرائح 54 إلى 56).</w:t>
+        <w:t>• المؤشرات والتقرير: KGI وKPI وKRI وKCI بالغرض لا كحدود ثابتة، وتعريف كل مؤشر بستة أسئلة (ما يقيسه، والحساب، والمصدر، والمالك، والدورية، وما يستدعي إجراءً)، وتقرير إدارة من صفحة واحدة معروض على شريحتين، ثم تمرين وإجابة، وأداة GRC تربط المتطلب بالضابط والدليل والخطر والملاحظة والإجراء (الشرائح 131 إلى 137).</w:t>
       </w:r>
     </w:p>
     <w:p>
@@ -184,21 +184,7 @@
           <w:sz w:val="21"/>
           <w:szCs w:val="21"/>
         </w:rPr>
-        <w:t>• في نافذة فيديو بعرض ثلث الشاشة يصبح نص 16 نقطة بارتفاع نحو 11 بكسل، فيُقرأ بصعوبة. لذلك تطلب ملاحظات المتحدث إيقاف الفيديو في التمارين، والكراسة فيها الأدلة كاملة جداول قابلة للقراءة.</w:t>
-      </w:r>
-    </w:p>
-    <w:p>
-      <w:pPr>
-        <w:pStyle w:val="Heading2"/>
-        <w:bidi/>
-      </w:pPr>
-      <w:r>
-        <w:rPr>
-          <w:rFonts w:ascii="Arial" w:hAnsi="Arial" w:cs="Arial" w:eastAsia="Arial"/>
-          <w:b w:val="0"/>
-          <w:bCs w:val="0"/>
-        </w:rPr>
-        <w:t>صناديق أقل وتكوين أوضح</w:t>
+        <w:t>• الأطر بثلاثة مستويات عمق (الشرائح 142 إلى 144): رئيسية (ECC وNFCRM وISO ‏27001 وNIST CSF)، وقطاعية وبيانات (SAMA CSF وPDPL وPCI DSS وGDPR)، وللتعريف (COBIT وCIS وNIST RMF وHIPAA وSOX). لكل مرجع نوعه وغرضه ونطاقه ولماذا تستخدمه الجهة. ومقارنتان: NIST CSF مقابل NIST RMF، وتقييم الفجوات مقابل تقييم النضج (الشريحة 149).</w:t>
       </w:r>
     </w:p>
     <w:p>
@@ -215,7 +201,7 @@
           <w:sz w:val="21"/>
           <w:szCs w:val="21"/>
         </w:rPr>
-        <w:t>• البطاقات النصية المتكررة استُبدلت بتخطيطات تناسب الفكرة: تدفق للمستويات الثلاثة، ومخطط تنظيمي للأدوار، وخطوات مرقمة، ومقارنات بخط علوي ملون بدل صندوق كامل، ونماذج عليها تعليقات مرقمة.</w:t>
+        <w:t>• المواءمة: مثال محلول ثم تمرين وإجابة بين ECC وISO ‏27001 وضابط داخلي ودليله، بحكم كلي أو جزئي، وتنبيه أن التشابه لا يثبت الالتزام (الشرائح 156 إلى 158).</w:t>
       </w:r>
     </w:p>
     <w:p>
@@ -232,21 +218,7 @@
           <w:sz w:val="21"/>
           <w:szCs w:val="21"/>
         </w:rPr>
-        <w:t>• لكل شريحة نقطة تركيز واحدة. والشارات ثابتة: الوحدة، و«التطبيق N من 4»، ونوع الشريحة (مثال محلول، تمرين، إجابة نموذجية).</w:t>
-      </w:r>
-    </w:p>
-    <w:p>
-      <w:pPr>
-        <w:pStyle w:val="Heading2"/>
-        <w:bidi/>
-      </w:pPr>
-      <w:r>
-        <w:rPr>
-          <w:rFonts w:ascii="Arial" w:hAnsi="Arial" w:cs="Arial" w:eastAsia="Arial"/>
-          <w:b w:val="0"/>
-          <w:bCs w:val="0"/>
-        </w:rPr>
-        <w:t>نماذج بصرية تعليمية</w:t>
+        <w:t>• اختبار قصير في نهاية كل وحدة (9 اختبارات، 33 سؤالاً). العرض يحدد موضع التوقف فقط، والأسئلة في الكراسة، والإجابات المفسرة مع سبب خطأ البدائل في ملف الإجابات.</w:t>
       </w:r>
     </w:p>
     <w:p>
@@ -263,7 +235,21 @@
           <w:sz w:val="21"/>
           <w:szCs w:val="21"/>
         </w:rPr>
-        <w:t>• الحوكمة: بند السياسة في صفحة وثيقة بتعليقات على المتطلب والمسؤول والتكرار والدليل (الشريحة 31)، والمعيار والإجراء للموضوع نفسه (الشريحتين 32 و33)، ومخطط المسؤوليات (الشريحة 22)، ومصفوفة RACI بحروف ملونة (الشريحة 30).</w:t>
+        <w:t>• تقييم ختامي عملي (الشريحة 215): حالة نسخ احتياطي لنظام الرواتب بأربعة أدلة. المطلوب: تحديد الخطر وتقييمه، واختيار ضابطين، وتقييم الأدلة ونوع كل فجوة، وكتابة ملاحظة وخطة تصحيح. والإجابة النموذجية فيها معايير التصحيح.</w:t>
+      </w:r>
+    </w:p>
+    <w:p>
+      <w:pPr>
+        <w:pStyle w:val="Heading2"/>
+        <w:bidi/>
+      </w:pPr>
+      <w:r>
+        <w:rPr>
+          <w:rFonts w:ascii="Arial" w:hAnsi="Arial" w:cs="Arial" w:eastAsia="Arial"/>
+          <w:b w:val="0"/>
+          <w:bCs w:val="0"/>
+        </w:rPr>
+        <w:t>ما طُوِّر دون تكرار</w:t>
       </w:r>
     </w:p>
     <w:p>
@@ -280,7 +266,7 @@
           <w:sz w:val="21"/>
           <w:szCs w:val="21"/>
         </w:rPr>
-        <w:t>• المخاطر: سجل مخاطر بشكل جدول بيانات ببيانات رُفاد، صف مكتمل ثم ثلاث شرائح تشرح أعمدته: الأصل ووصف الخطر، والضوابط والتقييم والمالك، والمعالجة والمتبقي والمتابعة (الشرائح 53 إلى 56). والمصفوفة بمحورين وعناوين أوضح (الشريحة 47).</w:t>
+        <w:t>• مكونات السياسة على سياسة واحدة كاملة: الغرض، والنطاق، والأدوار، والمتطلبات، والاستثناءات، والاعتماد والمراجعة (الشريحة 41).</w:t>
       </w:r>
     </w:p>
     <w:p>
@@ -297,7 +283,7 @@
           <w:sz w:val="21"/>
           <w:szCs w:val="21"/>
         </w:rPr>
-        <w:t>• الأدلة: لقطة إعداد التحقق، وسجل التغييرات، ومطابقة المعرّفات، وسجل الاتصالات بطريقة التحقق وتاريخ كل اتصال (الشرائح 76 إلى 79)، ولكل دليل الأسئلة الأربعة: ما الذي نراه؟ ماذا يثبت؟ ماذا لا يثبت؟ ما المطلوب إضافةً؟</w:t>
+        <w:t>• أمن العاملين: الانضمام وتغيير الدور والمغادرة، بأمثلة من رُفاد ودليل كل مرحلة (الشريحة 43).</w:t>
       </w:r>
     </w:p>
     <w:p>
@@ -314,7 +300,7 @@
           <w:sz w:val="21"/>
           <w:szCs w:val="21"/>
         </w:rPr>
-        <w:t>• وفي حالة المتدرب: ملف مراجعة الصلاحيات واعتماده، وتذكرة الإزالة، وتصدير الحسابات النشطة مع قائمة المغادرين (الشرائح 83 إلى 85)، ثم الإجابة بالأسئلة الأربعة (الشرائح 88 إلى 90).</w:t>
+        <w:t>• مخاطر الأطراف الخارجية صارت دورة من خمس مراحل: قبل التعاقد، والعقد، والوصول، والمتابعة، والإنهاء، وما ينقص سَنَد في كل مرحلة (الشريحة 84).</w:t>
       </w:r>
     </w:p>
     <w:p>
@@ -331,7 +317,7 @@
           <w:sz w:val="21"/>
           <w:szCs w:val="21"/>
         </w:rPr>
-        <w:t>• الملاحظة وخطة التصحيح: ملاحظة مكتملة في نموذج وثيقة (الشريحتين 95 و96)، ومتتبع إجراءات بالإجراء والمالك والموعد والحالة ودليل الإغلاق، والإجراءات مجموعة تحت شريطين ملونين: «معالجة الحالة» و«منع التكرار» (الشريحتين 94 و97).</w:t>
+        <w:t>• الفرق بين BIA وBCP وDRP والاستجابة للحوادث، وموضع RTO وRPO، وما يفعله GRC وما لا يفعله (الشريحة 86).</w:t>
       </w:r>
     </w:p>
     <w:p>
@@ -348,7 +334,7 @@
           <w:sz w:val="21"/>
           <w:szCs w:val="21"/>
         </w:rPr>
-        <w:t>• السيرة ولينكدإن: كل نموذج على شريحتين، وكل جزء مشروح بحجم مقروء (الشريحتين 146 و147، والشريحتين 155 و156).</w:t>
+        <w:t>• حالة رُفاد بقيت واحدة: الأرقام والأسماء والملاحظات F-03 وF-04 ومستويات الخطر متسقة بين الشرائح الجديدة والقديمة والكراسة.</w:t>
       </w:r>
     </w:p>
     <w:p>
@@ -365,7 +351,7 @@
           <w:sz w:val="21"/>
           <w:szCs w:val="21"/>
         </w:rPr>
-        <w:t>• أضيفت 19 شريحة، فصار العرض 184 شريحة بدل 165. المحتوى والتسلسل والتطبيقات كما هي.</w:t>
+        <w:t>• العرض الآن 231 شريحة بدل 184. الوحدات السابقة والتطبيقات الأربعة والشهادات والخطة والسيرة ولينكدإن والمقابلة باقية، وأُعيد ترقيم الوحدات وإحالات الشرائح.</w:t>
       </w:r>
     </w:p>
     <w:p>
@@ -379,7 +365,7 @@
           <w:b w:val="0"/>
           <w:bCs w:val="0"/>
         </w:rPr>
-        <w:t>قواعد النماذج والصور</w:t>
+        <w:t>ما لم يُضف عمداً</w:t>
       </w:r>
     </w:p>
     <w:p>
@@ -396,7 +382,21 @@
           <w:sz w:val="21"/>
           <w:szCs w:val="21"/>
         </w:rPr>
-        <w:t>• كل نموذج يحمل عبارة «نموذج تعليمي · بيانات افتراضية»، وواجهات الأنظمة عامة بلا اسم منتج ولا شعار، فلا يبدو أي منها لقطة من منصة تجارية.</w:t>
+        <w:t>• لم نضف تفاصيل RAID أو Homing أو SDN أو البرمجة أو تنفيذ الهجمات أو العينات الإحصائية أو SSAE، ولا تعمقاً في COBIT وCGEIT. الكورس لم يتحول إلى مسار تدقيق أو شبكات أو اختراق أو إدارة برنامج GRC.</w:t>
+      </w:r>
+    </w:p>
+    <w:p>
+      <w:pPr>
+        <w:pStyle w:val="Heading2"/>
+        <w:bidi/>
+      </w:pPr>
+      <w:r>
+        <w:rPr>
+          <w:rFonts w:ascii="Arial" w:hAnsi="Arial" w:cs="Arial" w:eastAsia="Arial"/>
+          <w:b w:val="0"/>
+          <w:bCs w:val="0"/>
+        </w:rPr>
+        <w:t>المصادر والتحقق</w:t>
       </w:r>
     </w:p>
     <w:p>
@@ -413,21 +413,7 @@
           <w:sz w:val="21"/>
           <w:szCs w:val="21"/>
         </w:rPr>
-        <w:t>• لا صور مولدة ولا لقطات شاشة خارجية: كل النماذج والجداول والمخططات عناصر قابلة للتحرير في PowerPoint، لذلك لا توجد صور خارجية تحتاج روابط مصدر.</w:t>
-      </w:r>
-    </w:p>
-    <w:p>
-      <w:pPr>
-        <w:pStyle w:val="Heading2"/>
-        <w:bidi/>
-      </w:pPr>
-      <w:r>
-        <w:rPr>
-          <w:rFonts w:ascii="Arial" w:hAnsi="Arial" w:cs="Arial" w:eastAsia="Arial"/>
-          <w:b w:val="0"/>
-          <w:bCs w:val="0"/>
-        </w:rPr>
-        <w:t>تصحيح مثال التحقق متعدد العوامل (التطبيق 3)</w:t>
+        <w:t>• نصوص ضوابط ECC المستشهد بها مأخوذة من الوثيقة الرسمية ECC-2:2024 وأرقامها في ملاحظات كل شريحة مع الرابط وتاريخ التحقق 27 أكتوبر 2026.</w:t>
       </w:r>
     </w:p>
     <w:p>
@@ -444,7 +430,7 @@
           <w:sz w:val="21"/>
           <w:szCs w:val="21"/>
         </w:rPr>
-        <w:t>• لم يعد المثال يستنتج من فرق العدد بين 41 و38. الدليل د4 صار قائمتين بالمعرّفات مطابقتين حساباً حساباً (الشريحة 78)، والدليل د6 الجديد مستخرج من سجل الاتصالات يبين طريقة التحقق وتاريخ كل اتصال للحسابات الثلاثة (الشريحة 79).</w:t>
+        <w:t>• نطاقات SAMA CSF وPCI DSS وGDPR وCIS Controls v‏8.1 وNIST RMF وNIST CSF من صفحاتها الرسمية، والروابط في الملاحظات.</w:t>
       </w:r>
     </w:p>
     <w:p>
@@ -461,7 +447,21 @@
           <w:sz w:val="21"/>
           <w:szCs w:val="21"/>
         </w:rPr>
-        <w:t>• سجل التغييرات (د3) يبين تفعيل الإلزام في 10 مارس الساعة 09:42، وإنشاء سياسة استثناء VPN-Legacy بعده بدقائق لثلاثة حسابات (الشريحة 77).</w:t>
+        <w:t>• المواءمات في الأمثلة تحكم بالتغطية الجزئية عمداً، ولا تدّعي مواءمة رسمية منشورة.</w:t>
+      </w:r>
+    </w:p>
+    <w:p>
+      <w:pPr>
+        <w:pStyle w:val="Heading2"/>
+        <w:bidi/>
+      </w:pPr>
+      <w:r>
+        <w:rPr>
+          <w:rFonts w:ascii="Arial" w:hAnsi="Arial" w:cs="Arial" w:eastAsia="Arial"/>
+          <w:b w:val="0"/>
+          <w:bCs w:val="0"/>
+        </w:rPr>
+        <w:t>الفحص قبل التسليم</w:t>
       </w:r>
     </w:p>
     <w:p>
@@ -478,7 +478,7 @@
           <w:sz w:val="21"/>
           <w:szCs w:val="21"/>
         </w:rPr>
-        <w:t>• حُدّثت الشرائح المتأثرة: أسئلة الفحص والنتيجة (الشريحة 80)، والملاحظة F-03 وسببها (الشريحتين 95 و96)، وخطة التصحيح، وملاحظات المتحدث، والكراسة والإجابات.</w:t>
+        <w:t>• عُرضت الشرائح الجديدة والمعدلة في مشغّل العرض وروجعت بصرياً. ما أصلحناه: أرقام ضوابط تنكسر في آخر السطر أو تنقلب بعد «و»، وجدول أداة GRC الذي كان يصغر، وعنوان التقييم الختامي الذي التف سطرين، وتقرير الإدارة الذي تجاوز حد الشريحة.</w:t>
       </w:r>
     </w:p>
     <w:p>
@@ -495,21 +495,7 @@
           <w:sz w:val="21"/>
           <w:szCs w:val="21"/>
         </w:rPr>
-        <w:t>• وصُحح استنتاج مشابه في إجابة الدليل د5: غياب موظف من مقتطف من 5 صفوف لا يعني أن حسابه أُلغي (الشريحة 90).</w:t>
-      </w:r>
-    </w:p>
-    <w:p>
-      <w:pPr>
-        <w:pStyle w:val="Heading2"/>
-        <w:bidi/>
-      </w:pPr>
-      <w:r>
-        <w:rPr>
-          <w:rFonts w:ascii="Arial" w:hAnsi="Arial" w:cs="Arial" w:eastAsia="Arial"/>
-          <w:b w:val="0"/>
-          <w:bCs w:val="0"/>
-        </w:rPr>
-        <w:t>بيانات تدريبية أضيفت (كلها افتراضية)</w:t>
+        <w:t>• ثم عُرضت الشرائح كلها (231) وروجعت، وتحققنا من إحالات أرقام الشرائح بعد إعادة الترقيم. وقورن ملف PowerPoint بالعرض مربعاً مربعاً: فروق صغيرة في ارتفاع صفوف بعض الجداول (9 شرائح، أغلبها قديمة) دون تداخل. وفُحص مرة أخرى بعد إخفاء الخطين فلم يظهر تداخل في الشرائح الجديدة.</w:t>
       </w:r>
     </w:p>
     <w:p>
@@ -526,205 +512,7 @@
           <w:sz w:val="21"/>
           <w:szCs w:val="21"/>
         </w:rPr>
-        <w:t>• التحقق متعدد العوامل: شاشة السياسة بتاريخ 5 يوليو، وسجل تغييرات من 4 أسطر (18 فبراير و10 مارس)، ومطابقة المعرّفات، وسجل اتصالات من 6 أسطر، وعدد اتصالات الحسابات الثلاثة: 9 و6 و14، أي 29.</w:t>
-      </w:r>
-    </w:p>
-    <w:p>
-      <w:pPr>
-        <w:bidi/>
-        <w:spacing w:after="60"/>
-        <w:ind w:right="283" w:hanging="255"/>
-      </w:pPr>
-      <w:r>
-        <w:rPr>
-          <w:rFonts w:ascii="Arial" w:hAnsi="Arial" w:cs="Arial" w:eastAsia="Arial"/>
-          <w:b w:val="0"/>
-          <w:bCs w:val="0"/>
-          <w:sz w:val="21"/>
-          <w:szCs w:val="21"/>
-        </w:rPr>
-        <w:t>• صلاحيات نظام الرواتب: مقتطف من ملف المراجعة (6 من 214، واعتماد 8 أبريل)، والتذكرة REQ-2026-0418 (فُتحت 8 أبريل وأُغلقت 20 مايو)، ومقتطف تصدير 2 يوليو (5 من 221)، والمغادرون الثلاثة في مايو بتواريخهم.</w:t>
-      </w:r>
-    </w:p>
-    <w:p>
-      <w:pPr>
-        <w:bidi/>
-        <w:spacing w:after="60"/>
-        <w:ind w:right="283" w:hanging="255"/>
-      </w:pPr>
-      <w:r>
-        <w:rPr>
-          <w:rFonts w:ascii="Arial" w:hAnsi="Arial" w:cs="Arial" w:eastAsia="Arial"/>
-          <w:b w:val="0"/>
-          <w:bCs w:val="0"/>
-          <w:sz w:val="21"/>
-          <w:szCs w:val="21"/>
-        </w:rPr>
-        <w:t>• رموز الوثائق POL-AC-01 وSTD-AC-01 وPRC-AC-03، ورقما الملاحظتين F-03 وF-04.</w:t>
-      </w:r>
-    </w:p>
-    <w:p>
-      <w:pPr>
-        <w:bidi/>
-        <w:spacing w:after="60"/>
-        <w:ind w:right="283" w:hanging="255"/>
-      </w:pPr>
-      <w:r>
-        <w:rPr>
-          <w:rFonts w:ascii="Arial" w:hAnsi="Arial" w:cs="Arial" w:eastAsia="Arial"/>
-          <w:b w:val="0"/>
-          <w:bCs w:val="0"/>
-          <w:sz w:val="21"/>
-          <w:szCs w:val="21"/>
-        </w:rPr>
-        <w:t>• كلها متسقة مع أرقام الحالة السابقة: 214 حساباً، و12 للإزالة، و9 أزيلت حتى 12 أبريل و3 في 20 مايو، و221 حساباً نشطاً في 2 يوليو، و38 عضواً و41 متصلاً.</w:t>
-      </w:r>
-    </w:p>
-    <w:p>
-      <w:pPr>
-        <w:pStyle w:val="Heading2"/>
-        <w:bidi/>
-      </w:pPr>
-      <w:r>
-        <w:rPr>
-          <w:rFonts w:ascii="Arial" w:hAnsi="Arial" w:cs="Arial" w:eastAsia="Arial"/>
-          <w:b w:val="0"/>
-          <w:bCs w:val="0"/>
-        </w:rPr>
-        <w:t>الشرائح 69 و70 و72 و108 وصفحات الروابط</w:t>
-      </w:r>
-    </w:p>
-    <w:p>
-      <w:pPr>
-        <w:bidi/>
-        <w:spacing w:after="60"/>
-        <w:ind w:right="283" w:hanging="255"/>
-      </w:pPr>
-      <w:r>
-        <w:rPr>
-          <w:rFonts w:ascii="Arial" w:hAnsi="Arial" w:cs="Arial" w:eastAsia="Arial"/>
-          <w:b w:val="0"/>
-          <w:bCs w:val="0"/>
-          <w:sz w:val="21"/>
-          <w:szCs w:val="21"/>
-        </w:rPr>
-        <w:t>• أرقامها تغيرت بعد الإضافات. هي الآن: الأدلة المستلمة في المثال (الشريحة 75)، والفحص والنتيجة (الشريحة 80)، وأدلة المتدرب (الشريحة 82)، وشهادات ISO من الاختبار إلى اللقب (الشريحة 126)، وصفحات الروابط (الشرائح 181 إلى 183).</w:t>
-      </w:r>
-    </w:p>
-    <w:p>
-      <w:pPr>
-        <w:bidi/>
-        <w:spacing w:after="60"/>
-        <w:ind w:right="283" w:hanging="255"/>
-      </w:pPr>
-      <w:r>
-        <w:rPr>
-          <w:rFonts w:ascii="Arial" w:hAnsi="Arial" w:cs="Arial" w:eastAsia="Arial"/>
-          <w:b w:val="0"/>
-          <w:bCs w:val="0"/>
-          <w:sz w:val="21"/>
-          <w:szCs w:val="21"/>
-        </w:rPr>
-        <w:t>• لم يظهر فيها تداخل حين عُرضت في مشغّل العرض نفسه ولا في Chromium. السبب الأرجح لما ظهر عندك: خط بديل حين لا يكون الخطان مثبتين، أو نص يلتف سطراً إضافياً في PowerPoint فيدخل في ما تحته، لأن مربعات النص في PowerPoint لا تدفع ما بعدها كما في المتصفح.</w:t>
-      </w:r>
-    </w:p>
-    <w:p>
-      <w:pPr>
-        <w:bidi/>
-        <w:spacing w:after="60"/>
-        <w:ind w:right="283" w:hanging="255"/>
-      </w:pPr>
-      <w:r>
-        <w:rPr>
-          <w:rFonts w:ascii="Arial" w:hAnsi="Arial" w:cs="Arial" w:eastAsia="Arial"/>
-          <w:b w:val="0"/>
-          <w:bCs w:val="0"/>
-          <w:sz w:val="21"/>
-          <w:szCs w:val="21"/>
-        </w:rPr>
-        <w:t>• فحصنا ملف PowerPoint نفسه بعد تحويله إلى PDF، مقارنة مربعاً مربعاً بالعرض الأصلي، فوجد تداخلين من هذا النوع وأصلحناهما: سؤالا الحوكمة والمخاطر (الشريحة 9)، وسؤال «مطبق» (الشريحة 69). وبقي فرق صغير في ارتفاع صفوف بعض الجداول (9 إلى 27 بكسل في الشرائح 15 و20 و30 و37 و86 و136) لا يسبب تداخلاً.</w:t>
-      </w:r>
-    </w:p>
-    <w:p>
-      <w:pPr>
-        <w:bidi/>
-        <w:spacing w:after="60"/>
-        <w:ind w:right="283" w:hanging="255"/>
-      </w:pPr>
-      <w:r>
-        <w:rPr>
-          <w:rFonts w:ascii="Arial" w:hAnsi="Arial" w:cs="Arial" w:eastAsia="Arial"/>
-          <w:b w:val="0"/>
-          <w:bCs w:val="0"/>
-          <w:sz w:val="21"/>
-          <w:szCs w:val="21"/>
-        </w:rPr>
-        <w:t>• وفحصناه مرة ثانية بعد إخفاء الخطين عن الجهاز، فاستبدل بهما LibreOffice خطوطاً أعرض. ظهرت عندها تداخلات في عناصر قصيرة: أسماء الوظائف في لينكدإن (الشريحة 160)، والمهارات (الشريحة 156)، والأرقام في الشريحة 110 والشريحة 164. فاستبدلنا بالأزرار الصغيرة نصاً يلتف بحرية، وأعطينا الأرقام خانات أعرض. وبقي رأس ملف لينكدإن (الشريحة 155) يتزاحم مع الخط البديل لأنه يحاكي مقاس الصفحة الحقيقية. الخلاصة: ثبّت الخطين قبل فتح الملف أو عرضه.</w:t>
-      </w:r>
-    </w:p>
-    <w:p>
-      <w:pPr>
-        <w:bidi/>
-        <w:spacing w:after="60"/>
-        <w:ind w:right="283" w:hanging="255"/>
-      </w:pPr>
-      <w:r>
-        <w:rPr>
-          <w:rFonts w:ascii="Arial" w:hAnsi="Arial" w:cs="Arial" w:eastAsia="Arial"/>
-          <w:b w:val="0"/>
-          <w:bCs w:val="0"/>
-          <w:sz w:val="21"/>
-          <w:szCs w:val="21"/>
-        </w:rPr>
-        <w:t>• عُرضت كل الشرائح في مشغّل العرض بدقة 1920×1080 وروجعت بصرياً. وما أصلحناه: كلمات انكسرت في منتصفها (R-07، والاحتمال، وISACA، ومفتوح)، وأعمدة فارغة في نماذج الجداول، وأسهم وأشرطة في غير موضعها، واتجاه «Security+» و«IT Audit Fund.» داخل النص العربي.</w:t>
-      </w:r>
-    </w:p>
-    <w:p>
-      <w:pPr>
-        <w:pStyle w:val="Heading2"/>
-        <w:bidi/>
-      </w:pPr>
-      <w:r>
-        <w:rPr>
-          <w:rFonts w:ascii="Arial" w:hAnsi="Arial" w:cs="Arial" w:eastAsia="Arial"/>
-          <w:b w:val="0"/>
-          <w:bCs w:val="0"/>
-        </w:rPr>
-        <w:t>ملاحظات المتحدث</w:t>
-      </w:r>
-    </w:p>
-    <w:p>
-      <w:pPr>
-        <w:bidi/>
-        <w:spacing w:after="60"/>
-        <w:ind w:right="283" w:hanging="255"/>
-      </w:pPr>
-      <w:r>
-        <w:rPr>
-          <w:rFonts w:ascii="Arial" w:hAnsi="Arial" w:cs="Arial" w:eastAsia="Arial"/>
-          <w:b w:val="0"/>
-          <w:bCs w:val="0"/>
-          <w:sz w:val="21"/>
-          <w:szCs w:val="21"/>
-        </w:rPr>
-        <w:t>• كُتبت من جديد لكل شريحة تغير شكلها، وتشرح ما يظهر عليها بالترتيب نفسه: من أي جزء يبدأ النظر، وماذا يعني كل تعليق مرقم.</w:t>
-      </w:r>
-    </w:p>
-    <w:p>
-      <w:pPr>
-        <w:bidi/>
-        <w:spacing w:after="60"/>
-        <w:ind w:right="283" w:hanging="255"/>
-      </w:pPr>
-      <w:r>
-        <w:rPr>
-          <w:rFonts w:ascii="Arial" w:hAnsi="Arial" w:cs="Arial" w:eastAsia="Arial"/>
-          <w:b w:val="0"/>
-          <w:bCs w:val="0"/>
-          <w:sz w:val="21"/>
-          <w:szCs w:val="21"/>
-        </w:rPr>
-        <w:t>• ملاحظات شرائح الأدلة تقول صراحة إن الواجهة نموذج تعليمي، لا لقطة من منتج حقيقي.</w:t>
+        <w:t>• نص القراءة (المتن والجداول والنماذج) بوسيط 18 نقطة في PowerPoint:‏ 60% منه 18 نقطة فأكثر، و93% منه 16 نقطة فأكثر، و7% أصغر من 16 نقطة. والمصادر والتذييلات وتسميات النماذج 12 إلى 13 نقطة، والعناوين 30 نقطة.</w:t>
       </w:r>
     </w:p>
     <w:p>
@@ -940,7 +728,7 @@
                 <w:sz w:val="20"/>
                 <w:szCs w:val="20"/>
               </w:rPr>
-              <w:t>الشريحتين 174 و175</w:t>
+              <w:t>الشريحتين 221 و222</w:t>
             </w:r>
           </w:p>
         </w:tc>
@@ -1011,7 +799,7 @@
                 <w:sz w:val="20"/>
                 <w:szCs w:val="20"/>
               </w:rPr>
-              <w:t>الشريحتين 128 و176</w:t>
+              <w:t>الشريحتين 169 و223</w:t>
             </w:r>
           </w:p>
         </w:tc>
@@ -1082,7 +870,7 @@
                 <w:sz w:val="20"/>
                 <w:szCs w:val="20"/>
               </w:rPr>
-              <w:t>الشرائح 134، 177، 178</w:t>
+              <w:t>الشرائح 175، 224، 225</w:t>
             </w:r>
           </w:p>
         </w:tc>
@@ -1153,7 +941,7 @@
                 <w:sz w:val="20"/>
                 <w:szCs w:val="20"/>
               </w:rPr>
-              <w:t>الشرائح 113، 114، 179، 180</w:t>
+              <w:t>الشرائح 150، 151، 226، 227</w:t>
             </w:r>
           </w:p>
         </w:tc>
@@ -1224,7 +1012,7 @@
                 <w:sz w:val="20"/>
                 <w:szCs w:val="20"/>
               </w:rPr>
-              <w:t>الشرائح 44 إلى 47</w:t>
+              <w:t>الشرائح 61 إلى 64</w:t>
             </w:r>
           </w:p>
         </w:tc>
@@ -1251,7 +1039,7 @@
                 <w:sz w:val="20"/>
                 <w:szCs w:val="20"/>
               </w:rPr>
-              <w:t>إصدارات ISO وNIST وPCI DSS</w:t>
+              <w:t>إصدارات ISO وNIST وPCI DSS وCIS، ونطاق SAMA CSF وGDPR وHIPAA وSOX</w:t>
             </w:r>
           </w:p>
         </w:tc>
@@ -1295,7 +1083,78 @@
                 <w:sz w:val="20"/>
                 <w:szCs w:val="20"/>
               </w:rPr>
-              <w:t>الشرائح 107 إلى 112</w:t>
+              <w:t>الشرائح 142 إلى 149</w:t>
+            </w:r>
+          </w:p>
+        </w:tc>
+      </w:tr>
+      <w:tr>
+        <w:trPr>
+          <w:cantSplit/>
+        </w:trPr>
+        <w:tc>
+          <w:tcPr>
+            <w:tcW w:type="dxa" w:w="3969"/>
+          </w:tcPr>
+          <w:p>
+            <w:pPr>
+              <w:bidi/>
+              <w:spacing w:after="20" w:line="252" w:lineRule="auto"/>
+            </w:pPr>
+            <w:r/>
+            <w:r>
+              <w:rPr>
+                <w:rFonts w:ascii="Arial" w:hAnsi="Arial" w:cs="Arial" w:eastAsia="Arial"/>
+                <w:b w:val="0"/>
+                <w:bCs w:val="0"/>
+                <w:sz w:val="20"/>
+                <w:szCs w:val="20"/>
+              </w:rPr>
+              <w:t>أرقام ضوابط ECC في الأساس التقني والمواءمة</w:t>
+            </w:r>
+          </w:p>
+        </w:tc>
+        <w:tc>
+          <w:tcPr>
+            <w:tcW w:type="dxa" w:w="2381"/>
+          </w:tcPr>
+          <w:p>
+            <w:pPr>
+              <w:bidi/>
+              <w:spacing w:after="20" w:line="252" w:lineRule="auto"/>
+            </w:pPr>
+            <w:r/>
+            <w:r>
+              <w:rPr>
+                <w:rFonts w:ascii="Arial" w:hAnsi="Arial" w:cs="Arial" w:eastAsia="Arial"/>
+                <w:b w:val="0"/>
+                <w:bCs w:val="0"/>
+                <w:sz w:val="20"/>
+                <w:szCs w:val="20"/>
+              </w:rPr>
+              <w:t>عند صدور إصدار جديد من ECC</w:t>
+            </w:r>
+          </w:p>
+        </w:tc>
+        <w:tc>
+          <w:tcPr>
+            <w:tcW w:type="dxa" w:w="3288"/>
+          </w:tcPr>
+          <w:p>
+            <w:pPr>
+              <w:bidi/>
+              <w:spacing w:after="20" w:line="252" w:lineRule="auto"/>
+            </w:pPr>
+            <w:r/>
+            <w:r>
+              <w:rPr>
+                <w:rFonts w:ascii="Arial" w:hAnsi="Arial" w:cs="Arial" w:eastAsia="Arial"/>
+                <w:b w:val="0"/>
+                <w:bCs w:val="0"/>
+                <w:sz w:val="20"/>
+                <w:szCs w:val="20"/>
+              </w:rPr>
+              <w:t>الشرائح 19 إلى 30، والشرائح 156 إلى 158</w:t>
             </w:r>
           </w:p>
         </w:tc>
@@ -1366,7 +1225,7 @@
                 <w:sz w:val="20"/>
                 <w:szCs w:val="20"/>
               </w:rPr>
-              <w:t>الشريحة 65</w:t>
+              <w:t>الشريحة 87</w:t>
             </w:r>
           </w:p>
         </w:tc>
@@ -1437,7 +1296,7 @@
                 <w:sz w:val="20"/>
                 <w:szCs w:val="20"/>
               </w:rPr>
-              <w:t>الشريحتين 155 و160</w:t>
+              <w:t>الشريحتين 199 و204</w:t>
             </w:r>
           </w:p>
         </w:tc>
@@ -1460,6 +1319,40 @@
           <w:bCs w:val="0"/>
         </w:rPr>
         <w:t>ما لم نتمكن من التحقق منه</w:t>
+      </w:r>
+    </w:p>
+    <w:p>
+      <w:pPr>
+        <w:bidi/>
+        <w:spacing w:after="60"/>
+        <w:ind w:right="283" w:hanging="255"/>
+      </w:pPr>
+      <w:r>
+        <w:rPr>
+          <w:rFonts w:ascii="Arial" w:hAnsi="Arial" w:cs="Arial" w:eastAsia="Arial"/>
+          <w:b w:val="0"/>
+          <w:bCs w:val="0"/>
+          <w:sz w:val="21"/>
+          <w:szCs w:val="21"/>
+        </w:rPr>
+        <w:t>• عناوين ضوابط ISO/IEC ‏27001:2022 في الملحق A (مثل A.5.18 وA.8.5): موقع ISO يمنع الوصول الآلي، فأُخذت من مصادر ثانوية متطابقة. الشرائح والإجابات تنبه إلى مطابقتها مع نسخة مرخصة من المعيار.</w:t>
+      </w:r>
+    </w:p>
+    <w:p>
+      <w:pPr>
+        <w:bidi/>
+        <w:spacing w:after="60"/>
+        <w:ind w:right="283" w:hanging="255"/>
+      </w:pPr>
+      <w:r>
+        <w:rPr>
+          <w:rFonts w:ascii="Arial" w:hAnsi="Arial" w:cs="Arial" w:eastAsia="Arial"/>
+          <w:b w:val="0"/>
+          <w:bCs w:val="0"/>
+          <w:sz w:val="21"/>
+          <w:szCs w:val="21"/>
+        </w:rPr>
+        <w:t>• HIPAA: صفحة وزارة الصحة الأمريكية رفضت الوصول الآلي (403)، فالوصف الموجز أُخذ من نتائج بحث تحيل إليها. الرابط الرسمي في الملاحظات.</w:t>
       </w:r>
     </w:p>
     <w:p>
@@ -1592,7 +1485,7 @@
           <w:sz w:val="21"/>
           <w:szCs w:val="21"/>
         </w:rPr>
-        <w:t>• 01_العرض/كيف_تبدأ_في_GRC.pptx: العرض القابل للتحرير، 184 شريحة، مع ملاحظات المتحدث والمصادر. يحتاج الخطين في 03_الخطوط مثبتين على الجهاز.</w:t>
+        <w:t>• 01_العرض/كيف_تبدأ_في_GRC.pptx: العرض القابل للتحرير، 231 شريحة، مع ملاحظات المتحدث والمصادر. يحتاج الخطين في 03_الخطوط مثبتين على الجهاز.</w:t>
       </w:r>
     </w:p>
     <w:p>
@@ -1626,7 +1519,7 @@
           <w:sz w:val="21"/>
           <w:szCs w:val="21"/>
         </w:rPr>
-        <w:t>• 02_الكراسة_والإجابات: كراسة التمارين (12 تمريناً، منها التطبيقات الأربعة بنماذج تعبأ ومقتطفات الأدلة جداول)، والإجابات النموذجية وطريقة الحل (ومنها جدول الأسئلة الأربعة للأدلة)، بصيغتي Word وPDF.</w:t>
+        <w:t>• 02_الكراسة_والإجابات: كراسة التمارين (17 تمريناً منها التطبيقات الأربعة، و9 اختبارات قصيرة، والتقييم الختامي)، والإجابات النموذجية وطريقة الحل (لكل اختبار سبب الإجابة وسبب خطأ البدائل، وللتقييم الختامي معايير التصحيح)، بصيغتي Word وPDF.</w:t>
       </w:r>
     </w:p>
     <w:p>

</xml_diff>